<commit_message>
bgry business clearance fix address not properly shown to the templates docs
</commit_message>
<xml_diff>
--- a/storage/app/templates/brgy_business_permit_template.docx
+++ b/storage/app/templates/brgy_business_permit_template.docx
@@ -267,6 +267,8 @@
                             <w:r>
                               <w:rPr>
                                 <w:b/>
+                                <w:sz w:val="24"/>
+                                <w:szCs w:val="24"/>
                               </w:rPr>
                               <w:t>${BUSINESS_ADDRESS}</w:t>
                             </w:r>
@@ -280,6 +282,8 @@
                                 <w:szCs w:val="24"/>
                               </w:rPr>
                             </w:pPr>
+                            <w:bookmarkStart w:id="0" w:name="_GoBack"/>
+                            <w:bookmarkEnd w:id="0"/>
                           </w:p>
                           <w:p>
                             <w:pPr>
@@ -1047,6 +1051,8 @@
                       <w:r>
                         <w:rPr>
                           <w:b/>
+                          <w:sz w:val="24"/>
+                          <w:szCs w:val="24"/>
                         </w:rPr>
                         <w:t>${BUSINESS_ADDRESS}</w:t>
                       </w:r>
@@ -1060,6 +1066,8 @@
                           <w:szCs w:val="24"/>
                         </w:rPr>
                       </w:pPr>
+                      <w:bookmarkStart w:id="1" w:name="_GoBack"/>
+                      <w:bookmarkEnd w:id="1"/>
                     </w:p>
                     <w:p>
                       <w:pPr>
@@ -1597,7 +1605,6 @@
           </mc:Fallback>
         </mc:AlternateContent>
       </w:r>
-      <w:bookmarkStart w:id="0" w:name="_GoBack"/>
       <w:r>
         <w:rPr>
           <w:noProof/>
@@ -1659,7 +1666,6 @@
           </wp:anchor>
         </w:drawing>
       </w:r>
-      <w:bookmarkEnd w:id="0"/>
       <w:r>
         <w:rPr>
           <w:noProof/>
@@ -2770,7 +2776,7 @@
 </file>
 
 <file path=customXml/itemProps1.xml><?xml version="1.0" encoding="utf-8"?>
-<ds:datastoreItem xmlns:ds="http://schemas.openxmlformats.org/officeDocument/2006/customXml" ds:itemID="{F502A5F7-BC3C-48C6-9801-D167F5893E61}">
+<ds:datastoreItem xmlns:ds="http://schemas.openxmlformats.org/officeDocument/2006/customXml" ds:itemID="{2B41B66B-E3EF-423C-86AE-752DC850E78F}">
   <ds:schemaRefs>
     <ds:schemaRef ds:uri="http://schemas.openxmlformats.org/officeDocument/2006/bibliography"/>
   </ds:schemaRefs>

</xml_diff>